<commit_message>
feat(advisory): implement 5-pillar financial risk diagnostic and strategic advisory matrix with ISO 31000 action conversion
</commit_message>
<xml_diff>
--- a/RiskGuard_Pro_Project_Report.docx
+++ b/RiskGuard_Pro_Project_Report.docx
@@ -2318,6 +2318,1311 @@
     </w:p>
     <w:p>
       <w:pPr>
+        <w:pStyle w:val="Heading2"/>
+      </w:pPr>
+      <w:r>
+        <w:rPr>
+          <w:b/>
+          <w:color w:val="065F46"/>
+          <w:sz w:val="26"/>
+        </w:rPr>
+        <w:t>The 5-Pillar Financial Diagnostic &amp; Advisory Framework</w:t>
+      </w:r>
+    </w:p>
+    <w:p>
+      <w:r>
+        <w:rPr>
+          <w:sz w:val="20"/>
+        </w:rPr>
+        <w:t>Beyond calculating raw quantitative values, RiskGuard Pro implements an automated 4-part financial advisory engine across 5 core corporate finance pillars. Rather than presenting generic warning badges, every calculated metric dynamically generates: (1) An ISO 31000 Risk Classification, (2) A Plain-Language Interpretation of what the result indicates, (3) Concrete Possible Business Impacts (e.g., supplier payment freezes, cash flow bottlenecks), and (4) An Actionable Mitigation Plan that can be converted directly into an assigned ISO 31000 Action Tracker task.</w:t>
+      </w:r>
+    </w:p>
+    <w:tbl>
+      <w:tblPr>
+        <w:tblW w:type="auto" w:w="0"/>
+        <w:jc w:val="center"/>
+        <w:tblLook w:firstColumn="1" w:firstRow="1" w:lastColumn="0" w:lastRow="0" w:noHBand="0" w:noVBand="1" w:val="04A0"/>
+      </w:tblPr>
+      <w:tblGrid>
+        <w:gridCol w:w="1872"/>
+        <w:gridCol w:w="1872"/>
+        <w:gridCol w:w="1872"/>
+        <w:gridCol w:w="1872"/>
+        <w:gridCol w:w="1872"/>
+      </w:tblGrid>
+      <w:tr>
+        <w:tc>
+          <w:tcPr>
+            <w:tcW w:type="dxa" w:w="1296"/>
+            <w:tcMar>
+              <w:top w:w="70" w:type="dxa"/>
+              <w:bottom w:w="70" w:type="dxa"/>
+              <w:left w:w="100" w:type="dxa"/>
+              <w:right w:w="100" w:type="dxa"/>
+            </w:tcMar>
+            <w:shd w:val="clear" w:color="auto" w:fill="064E3B"/>
+          </w:tcPr>
+          <w:p>
+            <w:pPr>
+              <w:spacing w:line="264" w:lineRule="auto" w:after="40"/>
+            </w:pPr>
+            <w:r>
+              <w:rPr>
+                <w:b/>
+                <w:color w:val="FFFFFF"/>
+                <w:sz w:val="17"/>
+              </w:rPr>
+              <w:t>Pillar</w:t>
+            </w:r>
+          </w:p>
+        </w:tc>
+        <w:tc>
+          <w:tcPr>
+            <w:tcW w:type="dxa" w:w="1872"/>
+            <w:tcMar>
+              <w:top w:w="70" w:type="dxa"/>
+              <w:bottom w:w="70" w:type="dxa"/>
+              <w:left w:w="100" w:type="dxa"/>
+              <w:right w:w="100" w:type="dxa"/>
+            </w:tcMar>
+            <w:shd w:val="clear" w:color="auto" w:fill="064E3B"/>
+          </w:tcPr>
+          <w:p>
+            <w:pPr>
+              <w:spacing w:line="264" w:lineRule="auto" w:after="40"/>
+            </w:pPr>
+            <w:r>
+              <w:rPr>
+                <w:b/>
+                <w:color w:val="FFFFFF"/>
+                <w:sz w:val="17"/>
+              </w:rPr>
+              <w:t>Financial Ratio</w:t>
+            </w:r>
+          </w:p>
+        </w:tc>
+        <w:tc>
+          <w:tcPr>
+            <w:tcW w:type="dxa" w:w="1728"/>
+            <w:tcMar>
+              <w:top w:w="70" w:type="dxa"/>
+              <w:bottom w:w="70" w:type="dxa"/>
+              <w:left w:w="100" w:type="dxa"/>
+              <w:right w:w="100" w:type="dxa"/>
+            </w:tcMar>
+            <w:shd w:val="clear" w:color="auto" w:fill="064E3B"/>
+          </w:tcPr>
+          <w:p>
+            <w:pPr>
+              <w:spacing w:line="264" w:lineRule="auto" w:after="40"/>
+            </w:pPr>
+            <w:r>
+              <w:rPr>
+                <w:b/>
+                <w:color w:val="FFFFFF"/>
+                <w:sz w:val="17"/>
+              </w:rPr>
+              <w:t>Risk Thresholds</w:t>
+            </w:r>
+          </w:p>
+        </w:tc>
+        <w:tc>
+          <w:tcPr>
+            <w:tcW w:type="dxa" w:w="3168"/>
+            <w:tcMar>
+              <w:top w:w="70" w:type="dxa"/>
+              <w:bottom w:w="70" w:type="dxa"/>
+              <w:left w:w="100" w:type="dxa"/>
+              <w:right w:w="100" w:type="dxa"/>
+            </w:tcMar>
+            <w:shd w:val="clear" w:color="auto" w:fill="064E3B"/>
+          </w:tcPr>
+          <w:p>
+            <w:pPr>
+              <w:spacing w:line="264" w:lineRule="auto" w:after="40"/>
+            </w:pPr>
+            <w:r>
+              <w:rPr>
+                <w:b/>
+                <w:color w:val="FFFFFF"/>
+                <w:sz w:val="17"/>
+              </w:rPr>
+              <w:t>Clinical Interpretation &amp; Possible Impact</w:t>
+            </w:r>
+          </w:p>
+        </w:tc>
+        <w:tc>
+          <w:tcPr>
+            <w:tcW w:type="dxa" w:w="2592"/>
+            <w:tcMar>
+              <w:top w:w="70" w:type="dxa"/>
+              <w:bottom w:w="70" w:type="dxa"/>
+              <w:left w:w="100" w:type="dxa"/>
+              <w:right w:w="100" w:type="dxa"/>
+            </w:tcMar>
+            <w:shd w:val="clear" w:color="auto" w:fill="064E3B"/>
+          </w:tcPr>
+          <w:p>
+            <w:pPr>
+              <w:spacing w:line="264" w:lineRule="auto" w:after="40"/>
+            </w:pPr>
+            <w:r>
+              <w:rPr>
+                <w:b/>
+                <w:color w:val="FFFFFF"/>
+                <w:sz w:val="17"/>
+              </w:rPr>
+              <w:t>Actionable Mitigation Plan</w:t>
+            </w:r>
+          </w:p>
+        </w:tc>
+      </w:tr>
+      <w:tr>
+        <w:tc>
+          <w:tcPr>
+            <w:tcW w:type="dxa" w:w="1296"/>
+            <w:tcMar>
+              <w:top w:w="70" w:type="dxa"/>
+              <w:bottom w:w="70" w:type="dxa"/>
+              <w:left w:w="100" w:type="dxa"/>
+              <w:right w:w="100" w:type="dxa"/>
+            </w:tcMar>
+            <w:shd w:val="clear" w:color="auto" w:fill="F0FDF4"/>
+          </w:tcPr>
+          <w:p>
+            <w:pPr>
+              <w:spacing w:line="264" w:lineRule="auto" w:after="40"/>
+            </w:pPr>
+            <w:r>
+              <w:rPr>
+                <w:sz w:val="15"/>
+              </w:rPr>
+              <w:t>Liquidity</w:t>
+            </w:r>
+          </w:p>
+        </w:tc>
+        <w:tc>
+          <w:tcPr>
+            <w:tcW w:type="dxa" w:w="1872"/>
+            <w:tcMar>
+              <w:top w:w="70" w:type="dxa"/>
+              <w:bottom w:w="70" w:type="dxa"/>
+              <w:left w:w="100" w:type="dxa"/>
+              <w:right w:w="100" w:type="dxa"/>
+            </w:tcMar>
+            <w:shd w:val="clear" w:color="auto" w:fill="F0FDF4"/>
+          </w:tcPr>
+          <w:p>
+            <w:pPr>
+              <w:spacing w:line="264" w:lineRule="auto" w:after="40"/>
+            </w:pPr>
+            <w:r>
+              <w:rPr>
+                <w:sz w:val="15"/>
+              </w:rPr>
+              <w:t>Current Ratio (CA ÷ CL)</w:t>
+            </w:r>
+          </w:p>
+        </w:tc>
+        <w:tc>
+          <w:tcPr>
+            <w:tcW w:type="dxa" w:w="1728"/>
+            <w:tcMar>
+              <w:top w:w="70" w:type="dxa"/>
+              <w:bottom w:w="70" w:type="dxa"/>
+              <w:left w:w="100" w:type="dxa"/>
+              <w:right w:w="100" w:type="dxa"/>
+            </w:tcMar>
+            <w:shd w:val="clear" w:color="auto" w:fill="F0FDF4"/>
+          </w:tcPr>
+          <w:p>
+            <w:pPr>
+              <w:spacing w:line="264" w:lineRule="auto" w:after="40"/>
+            </w:pPr>
+            <w:r>
+              <w:rPr>
+                <w:sz w:val="15"/>
+              </w:rPr>
+              <w:t>Low: ≥1.8x</w:t>
+              <w:br/>
+              <w:t>Mod: 1.2–1.8x</w:t>
+              <w:br/>
+              <w:t>High: &lt;1.2x</w:t>
+            </w:r>
+          </w:p>
+        </w:tc>
+        <w:tc>
+          <w:tcPr>
+            <w:tcW w:type="dxa" w:w="3168"/>
+            <w:tcMar>
+              <w:top w:w="70" w:type="dxa"/>
+              <w:bottom w:w="70" w:type="dxa"/>
+              <w:left w:w="100" w:type="dxa"/>
+              <w:right w:w="100" w:type="dxa"/>
+            </w:tcMar>
+            <w:shd w:val="clear" w:color="auto" w:fill="F0FDF4"/>
+          </w:tcPr>
+          <w:p>
+            <w:pPr>
+              <w:spacing w:line="264" w:lineRule="auto" w:after="40"/>
+            </w:pPr>
+            <w:r>
+              <w:rPr>
+                <w:sz w:val="15"/>
+              </w:rPr>
+              <w:t>Low: Ample short-term assets to pay obligations without strain.</w:t>
+              <w:br/>
+              <w:t>Moderate: Slim safety buffer; vulnerable to customer payment delays.</w:t>
+              <w:br/>
+              <w:t>High: Current liabilities exceed assets; acute risk of supplier defaults.</w:t>
+            </w:r>
+          </w:p>
+        </w:tc>
+        <w:tc>
+          <w:tcPr>
+            <w:tcW w:type="dxa" w:w="2592"/>
+            <w:tcMar>
+              <w:top w:w="70" w:type="dxa"/>
+              <w:bottom w:w="70" w:type="dxa"/>
+              <w:left w:w="100" w:type="dxa"/>
+              <w:right w:w="100" w:type="dxa"/>
+            </w:tcMar>
+            <w:shd w:val="clear" w:color="auto" w:fill="F0FDF4"/>
+          </w:tcPr>
+          <w:p>
+            <w:pPr>
+              <w:spacing w:line="264" w:lineRule="auto" w:after="40"/>
+            </w:pPr>
+            <w:r>
+              <w:rPr>
+                <w:sz w:val="15"/>
+              </w:rPr>
+              <w:t>Accelerate debtor collections, eliminate surplus slow-moving stock, negotiate vendor credit extensions, and avoid hoarding idle cash.</w:t>
+            </w:r>
+          </w:p>
+        </w:tc>
+      </w:tr>
+      <w:tr>
+        <w:tc>
+          <w:tcPr>
+            <w:tcW w:type="dxa" w:w="1296"/>
+            <w:tcMar>
+              <w:top w:w="70" w:type="dxa"/>
+              <w:bottom w:w="70" w:type="dxa"/>
+              <w:left w:w="100" w:type="dxa"/>
+              <w:right w:w="100" w:type="dxa"/>
+            </w:tcMar>
+            <w:shd w:val="clear" w:color="auto" w:fill="FFFFFF"/>
+          </w:tcPr>
+          <w:p>
+            <w:pPr>
+              <w:spacing w:line="264" w:lineRule="auto" w:after="40"/>
+            </w:pPr>
+            <w:r>
+              <w:rPr>
+                <w:sz w:val="15"/>
+              </w:rPr>
+              <w:t>Liquidity</w:t>
+            </w:r>
+          </w:p>
+        </w:tc>
+        <w:tc>
+          <w:tcPr>
+            <w:tcW w:type="dxa" w:w="1872"/>
+            <w:tcMar>
+              <w:top w:w="70" w:type="dxa"/>
+              <w:bottom w:w="70" w:type="dxa"/>
+              <w:left w:w="100" w:type="dxa"/>
+              <w:right w:w="100" w:type="dxa"/>
+            </w:tcMar>
+            <w:shd w:val="clear" w:color="auto" w:fill="FFFFFF"/>
+          </w:tcPr>
+          <w:p>
+            <w:pPr>
+              <w:spacing w:line="264" w:lineRule="auto" w:after="40"/>
+            </w:pPr>
+            <w:r>
+              <w:rPr>
+                <w:sz w:val="15"/>
+              </w:rPr>
+              <w:t>Quick Ratio ((CA−Inv) ÷ CL)</w:t>
+            </w:r>
+          </w:p>
+        </w:tc>
+        <w:tc>
+          <w:tcPr>
+            <w:tcW w:type="dxa" w:w="1728"/>
+            <w:tcMar>
+              <w:top w:w="70" w:type="dxa"/>
+              <w:bottom w:w="70" w:type="dxa"/>
+              <w:left w:w="100" w:type="dxa"/>
+              <w:right w:w="100" w:type="dxa"/>
+            </w:tcMar>
+            <w:shd w:val="clear" w:color="auto" w:fill="FFFFFF"/>
+          </w:tcPr>
+          <w:p>
+            <w:pPr>
+              <w:spacing w:line="264" w:lineRule="auto" w:after="40"/>
+            </w:pPr>
+            <w:r>
+              <w:rPr>
+                <w:sz w:val="15"/>
+              </w:rPr>
+              <w:t>Low: ≥1.0x</w:t>
+              <w:br/>
+              <w:t>Mod: 0.8–1.0x</w:t>
+              <w:br/>
+              <w:t>High: &lt;0.8x</w:t>
+            </w:r>
+          </w:p>
+        </w:tc>
+        <w:tc>
+          <w:tcPr>
+            <w:tcW w:type="dxa" w:w="3168"/>
+            <w:tcMar>
+              <w:top w:w="70" w:type="dxa"/>
+              <w:bottom w:w="70" w:type="dxa"/>
+              <w:left w:w="100" w:type="dxa"/>
+              <w:right w:w="100" w:type="dxa"/>
+            </w:tcMar>
+            <w:shd w:val="clear" w:color="auto" w:fill="FFFFFF"/>
+          </w:tcPr>
+          <w:p>
+            <w:pPr>
+              <w:spacing w:line="264" w:lineRule="auto" w:after="40"/>
+            </w:pPr>
+            <w:r>
+              <w:rPr>
+                <w:sz w:val="15"/>
+              </w:rPr>
+              <w:t>Low: Instant settlement capacity without relying on inventory liquidation.</w:t>
+              <w:br/>
+              <w:t>Moderate: Slight immediate payment pressure if receivables lag.</w:t>
+              <w:br/>
+              <w:t>High: Critically dependent on future sales to cover immediate debt obligations.</w:t>
+            </w:r>
+          </w:p>
+        </w:tc>
+        <w:tc>
+          <w:tcPr>
+            <w:tcW w:type="dxa" w:w="2592"/>
+            <w:tcMar>
+              <w:top w:w="70" w:type="dxa"/>
+              <w:bottom w:w="70" w:type="dxa"/>
+              <w:left w:w="100" w:type="dxa"/>
+              <w:right w:w="100" w:type="dxa"/>
+            </w:tcMar>
+            <w:shd w:val="clear" w:color="auto" w:fill="FFFFFF"/>
+          </w:tcPr>
+          <w:p>
+            <w:pPr>
+              <w:spacing w:line="264" w:lineRule="auto" w:after="40"/>
+            </w:pPr>
+            <w:r>
+              <w:rPr>
+                <w:sz w:val="15"/>
+              </w:rPr>
+              <w:t>Deploy automated invoice factoring for accounts receivable and establish emergency overdraft credit lines.</w:t>
+            </w:r>
+          </w:p>
+        </w:tc>
+      </w:tr>
+      <w:tr>
+        <w:tc>
+          <w:tcPr>
+            <w:tcW w:type="dxa" w:w="1296"/>
+            <w:tcMar>
+              <w:top w:w="70" w:type="dxa"/>
+              <w:bottom w:w="70" w:type="dxa"/>
+              <w:left w:w="100" w:type="dxa"/>
+              <w:right w:w="100" w:type="dxa"/>
+            </w:tcMar>
+            <w:shd w:val="clear" w:color="auto" w:fill="F0FDF4"/>
+          </w:tcPr>
+          <w:p>
+            <w:pPr>
+              <w:spacing w:line="264" w:lineRule="auto" w:after="40"/>
+            </w:pPr>
+            <w:r>
+              <w:rPr>
+                <w:sz w:val="15"/>
+              </w:rPr>
+              <w:t>Profitability</w:t>
+            </w:r>
+          </w:p>
+        </w:tc>
+        <w:tc>
+          <w:tcPr>
+            <w:tcW w:type="dxa" w:w="1872"/>
+            <w:tcMar>
+              <w:top w:w="70" w:type="dxa"/>
+              <w:bottom w:w="70" w:type="dxa"/>
+              <w:left w:w="100" w:type="dxa"/>
+              <w:right w:w="100" w:type="dxa"/>
+            </w:tcMar>
+            <w:shd w:val="clear" w:color="auto" w:fill="F0FDF4"/>
+          </w:tcPr>
+          <w:p>
+            <w:pPr>
+              <w:spacing w:line="264" w:lineRule="auto" w:after="40"/>
+            </w:pPr>
+            <w:r>
+              <w:rPr>
+                <w:sz w:val="15"/>
+              </w:rPr>
+              <w:t>Net Profit Margin ((PAT ÷ Rev) × 100)</w:t>
+            </w:r>
+          </w:p>
+        </w:tc>
+        <w:tc>
+          <w:tcPr>
+            <w:tcW w:type="dxa" w:w="1728"/>
+            <w:tcMar>
+              <w:top w:w="70" w:type="dxa"/>
+              <w:bottom w:w="70" w:type="dxa"/>
+              <w:left w:w="100" w:type="dxa"/>
+              <w:right w:w="100" w:type="dxa"/>
+            </w:tcMar>
+            <w:shd w:val="clear" w:color="auto" w:fill="F0FDF4"/>
+          </w:tcPr>
+          <w:p>
+            <w:pPr>
+              <w:spacing w:line="264" w:lineRule="auto" w:after="40"/>
+            </w:pPr>
+            <w:r>
+              <w:rPr>
+                <w:sz w:val="15"/>
+              </w:rPr>
+              <w:t>Low: ≥8.0%</w:t>
+              <w:br/>
+              <w:t>Mod: 3.0–8.0%</w:t>
+              <w:br/>
+              <w:t>High: &lt;3.0% / Negative</w:t>
+            </w:r>
+          </w:p>
+        </w:tc>
+        <w:tc>
+          <w:tcPr>
+            <w:tcW w:type="dxa" w:w="3168"/>
+            <w:tcMar>
+              <w:top w:w="70" w:type="dxa"/>
+              <w:bottom w:w="70" w:type="dxa"/>
+              <w:left w:w="100" w:type="dxa"/>
+              <w:right w:w="100" w:type="dxa"/>
+            </w:tcMar>
+            <w:shd w:val="clear" w:color="auto" w:fill="F0FDF4"/>
+          </w:tcPr>
+          <w:p>
+            <w:pPr>
+              <w:spacing w:line="264" w:lineRule="auto" w:after="40"/>
+            </w:pPr>
+            <w:r>
+              <w:rPr>
+                <w:sz w:val="15"/>
+              </w:rPr>
+              <w:t>Low: Strong net earnings retained after all expenses, taxes, and finance costs.</w:t>
+              <w:br/>
+              <w:t>Moderate: Margin compression from direct costs or overheads.</w:t>
+              <w:br/>
+              <w:t>High: Operating losses eroding shareholder net worth and retained reserves.</w:t>
+            </w:r>
+          </w:p>
+        </w:tc>
+        <w:tc>
+          <w:tcPr>
+            <w:tcW w:type="dxa" w:w="2592"/>
+            <w:tcMar>
+              <w:top w:w="70" w:type="dxa"/>
+              <w:bottom w:w="70" w:type="dxa"/>
+              <w:left w:w="100" w:type="dxa"/>
+              <w:right w:w="100" w:type="dxa"/>
+            </w:tcMar>
+            <w:shd w:val="clear" w:color="auto" w:fill="F0FDF4"/>
+          </w:tcPr>
+          <w:p>
+            <w:pPr>
+              <w:spacing w:line="264" w:lineRule="auto" w:after="40"/>
+            </w:pPr>
+            <w:r>
+              <w:rPr>
+                <w:sz w:val="15"/>
+              </w:rPr>
+              <w:t>Implement operational cost restructuring, discontinue low-margin product lines, and renegotiate major supplier contracts.</w:t>
+            </w:r>
+          </w:p>
+        </w:tc>
+      </w:tr>
+      <w:tr>
+        <w:tc>
+          <w:tcPr>
+            <w:tcW w:type="dxa" w:w="1296"/>
+            <w:tcMar>
+              <w:top w:w="70" w:type="dxa"/>
+              <w:bottom w:w="70" w:type="dxa"/>
+              <w:left w:w="100" w:type="dxa"/>
+              <w:right w:w="100" w:type="dxa"/>
+            </w:tcMar>
+            <w:shd w:val="clear" w:color="auto" w:fill="FFFFFF"/>
+          </w:tcPr>
+          <w:p>
+            <w:pPr>
+              <w:spacing w:line="264" w:lineRule="auto" w:after="40"/>
+            </w:pPr>
+            <w:r>
+              <w:rPr>
+                <w:sz w:val="15"/>
+              </w:rPr>
+              <w:t>Profitability</w:t>
+            </w:r>
+          </w:p>
+        </w:tc>
+        <w:tc>
+          <w:tcPr>
+            <w:tcW w:type="dxa" w:w="1872"/>
+            <w:tcMar>
+              <w:top w:w="70" w:type="dxa"/>
+              <w:bottom w:w="70" w:type="dxa"/>
+              <w:left w:w="100" w:type="dxa"/>
+              <w:right w:w="100" w:type="dxa"/>
+            </w:tcMar>
+            <w:shd w:val="clear" w:color="auto" w:fill="FFFFFF"/>
+          </w:tcPr>
+          <w:p>
+            <w:pPr>
+              <w:spacing w:line="264" w:lineRule="auto" w:after="40"/>
+            </w:pPr>
+            <w:r>
+              <w:rPr>
+                <w:sz w:val="15"/>
+              </w:rPr>
+              <w:t>Operating Margin ((EBIT ÷ Rev) × 100)</w:t>
+            </w:r>
+          </w:p>
+        </w:tc>
+        <w:tc>
+          <w:tcPr>
+            <w:tcW w:type="dxa" w:w="1728"/>
+            <w:tcMar>
+              <w:top w:w="70" w:type="dxa"/>
+              <w:bottom w:w="70" w:type="dxa"/>
+              <w:left w:w="100" w:type="dxa"/>
+              <w:right w:w="100" w:type="dxa"/>
+            </w:tcMar>
+            <w:shd w:val="clear" w:color="auto" w:fill="FFFFFF"/>
+          </w:tcPr>
+          <w:p>
+            <w:pPr>
+              <w:spacing w:line="264" w:lineRule="auto" w:after="40"/>
+            </w:pPr>
+            <w:r>
+              <w:rPr>
+                <w:sz w:val="15"/>
+              </w:rPr>
+              <w:t>Low: ≥12.0%</w:t>
+              <w:br/>
+              <w:t>Mod: 6.0–12.0%</w:t>
+              <w:br/>
+              <w:t>High: &lt;6.0%</w:t>
+            </w:r>
+          </w:p>
+        </w:tc>
+        <w:tc>
+          <w:tcPr>
+            <w:tcW w:type="dxa" w:w="3168"/>
+            <w:tcMar>
+              <w:top w:w="70" w:type="dxa"/>
+              <w:bottom w:w="70" w:type="dxa"/>
+              <w:left w:w="100" w:type="dxa"/>
+              <w:right w:w="100" w:type="dxa"/>
+            </w:tcMar>
+            <w:shd w:val="clear" w:color="auto" w:fill="FFFFFF"/>
+          </w:tcPr>
+          <w:p>
+            <w:pPr>
+              <w:spacing w:line="264" w:lineRule="auto" w:after="40"/>
+            </w:pPr>
+            <w:r>
+              <w:rPr>
+                <w:sz w:val="15"/>
+              </w:rPr>
+              <w:t>Low: High core operational profitability and pricing power.</w:t>
+              <w:br/>
+              <w:t>Moderate: Vulnerable to raw material or utility cost spikes.</w:t>
+              <w:br/>
+              <w:t>High: Core business failing to generate sufficient operating cash before interest.</w:t>
+            </w:r>
+          </w:p>
+        </w:tc>
+        <w:tc>
+          <w:tcPr>
+            <w:tcW w:type="dxa" w:w="2592"/>
+            <w:tcMar>
+              <w:top w:w="70" w:type="dxa"/>
+              <w:bottom w:w="70" w:type="dxa"/>
+              <w:left w:w="100" w:type="dxa"/>
+              <w:right w:w="100" w:type="dxa"/>
+            </w:tcMar>
+            <w:shd w:val="clear" w:color="auto" w:fill="FFFFFF"/>
+          </w:tcPr>
+          <w:p>
+            <w:pPr>
+              <w:spacing w:line="264" w:lineRule="auto" w:after="40"/>
+            </w:pPr>
+            <w:r>
+              <w:rPr>
+                <w:sz w:val="15"/>
+              </w:rPr>
+              <w:t>Audit direct production costs, implement lean manufacturing, and automate SG&amp;A administrative processes.</w:t>
+            </w:r>
+          </w:p>
+        </w:tc>
+      </w:tr>
+      <w:tr>
+        <w:tc>
+          <w:tcPr>
+            <w:tcW w:type="dxa" w:w="1296"/>
+            <w:tcMar>
+              <w:top w:w="70" w:type="dxa"/>
+              <w:bottom w:w="70" w:type="dxa"/>
+              <w:left w:w="100" w:type="dxa"/>
+              <w:right w:w="100" w:type="dxa"/>
+            </w:tcMar>
+            <w:shd w:val="clear" w:color="auto" w:fill="F0FDF4"/>
+          </w:tcPr>
+          <w:p>
+            <w:pPr>
+              <w:spacing w:line="264" w:lineRule="auto" w:after="40"/>
+            </w:pPr>
+            <w:r>
+              <w:rPr>
+                <w:sz w:val="15"/>
+              </w:rPr>
+              <w:t>Solvency</w:t>
+            </w:r>
+          </w:p>
+        </w:tc>
+        <w:tc>
+          <w:tcPr>
+            <w:tcW w:type="dxa" w:w="1872"/>
+            <w:tcMar>
+              <w:top w:w="70" w:type="dxa"/>
+              <w:bottom w:w="70" w:type="dxa"/>
+              <w:left w:w="100" w:type="dxa"/>
+              <w:right w:w="100" w:type="dxa"/>
+            </w:tcMar>
+            <w:shd w:val="clear" w:color="auto" w:fill="F0FDF4"/>
+          </w:tcPr>
+          <w:p>
+            <w:pPr>
+              <w:spacing w:line="264" w:lineRule="auto" w:after="40"/>
+            </w:pPr>
+            <w:r>
+              <w:rPr>
+                <w:sz w:val="15"/>
+              </w:rPr>
+              <w:t>Debt-to-Equity (Total Debt ÷ Equity)</w:t>
+            </w:r>
+          </w:p>
+        </w:tc>
+        <w:tc>
+          <w:tcPr>
+            <w:tcW w:type="dxa" w:w="1728"/>
+            <w:tcMar>
+              <w:top w:w="70" w:type="dxa"/>
+              <w:bottom w:w="70" w:type="dxa"/>
+              <w:left w:w="100" w:type="dxa"/>
+              <w:right w:w="100" w:type="dxa"/>
+            </w:tcMar>
+            <w:shd w:val="clear" w:color="auto" w:fill="F0FDF4"/>
+          </w:tcPr>
+          <w:p>
+            <w:pPr>
+              <w:spacing w:line="264" w:lineRule="auto" w:after="40"/>
+            </w:pPr>
+            <w:r>
+              <w:rPr>
+                <w:sz w:val="15"/>
+              </w:rPr>
+              <w:t>Low: ≤0.8x</w:t>
+              <w:br/>
+              <w:t>Mod: 0.8–1.8x</w:t>
+              <w:br/>
+              <w:t>High: &gt;1.8x</w:t>
+            </w:r>
+          </w:p>
+        </w:tc>
+        <w:tc>
+          <w:tcPr>
+            <w:tcW w:type="dxa" w:w="3168"/>
+            <w:tcMar>
+              <w:top w:w="70" w:type="dxa"/>
+              <w:bottom w:w="70" w:type="dxa"/>
+              <w:left w:w="100" w:type="dxa"/>
+              <w:right w:w="100" w:type="dxa"/>
+            </w:tcMar>
+            <w:shd w:val="clear" w:color="auto" w:fill="F0FDF4"/>
+          </w:tcPr>
+          <w:p>
+            <w:pPr>
+              <w:spacing w:line="264" w:lineRule="auto" w:after="40"/>
+            </w:pPr>
+            <w:r>
+              <w:rPr>
+                <w:sz w:val="15"/>
+              </w:rPr>
+              <w:t>Low: Conservative leverage; robust owner equity buffer against creditors.</w:t>
+              <w:br/>
+              <w:t>Moderate: Substantial leverage; higher periodic finance charge burden.</w:t>
+              <w:br/>
+              <w:t>High: Dangerously over-leveraged; high probability of debt covenant breach.</w:t>
+            </w:r>
+          </w:p>
+        </w:tc>
+        <w:tc>
+          <w:tcPr>
+            <w:tcW w:type="dxa" w:w="2592"/>
+            <w:tcMar>
+              <w:top w:w="70" w:type="dxa"/>
+              <w:bottom w:w="70" w:type="dxa"/>
+              <w:left w:w="100" w:type="dxa"/>
+              <w:right w:w="100" w:type="dxa"/>
+            </w:tcMar>
+            <w:shd w:val="clear" w:color="auto" w:fill="F0FDF4"/>
+          </w:tcPr>
+          <w:p>
+            <w:pPr>
+              <w:spacing w:line="264" w:lineRule="auto" w:after="40"/>
+            </w:pPr>
+            <w:r>
+              <w:rPr>
+                <w:sz w:val="15"/>
+              </w:rPr>
+              <w:t>Cap further long-term debt drawdowns, establish debt amortisation sinking funds, and retain annual net earnings.</w:t>
+            </w:r>
+          </w:p>
+        </w:tc>
+      </w:tr>
+      <w:tr>
+        <w:tc>
+          <w:tcPr>
+            <w:tcW w:type="dxa" w:w="1296"/>
+            <w:tcMar>
+              <w:top w:w="70" w:type="dxa"/>
+              <w:bottom w:w="70" w:type="dxa"/>
+              <w:left w:w="100" w:type="dxa"/>
+              <w:right w:w="100" w:type="dxa"/>
+            </w:tcMar>
+            <w:shd w:val="clear" w:color="auto" w:fill="FFFFFF"/>
+          </w:tcPr>
+          <w:p>
+            <w:pPr>
+              <w:spacing w:line="264" w:lineRule="auto" w:after="40"/>
+            </w:pPr>
+            <w:r>
+              <w:rPr>
+                <w:sz w:val="15"/>
+              </w:rPr>
+              <w:t>Solvency</w:t>
+            </w:r>
+          </w:p>
+        </w:tc>
+        <w:tc>
+          <w:tcPr>
+            <w:tcW w:type="dxa" w:w="1872"/>
+            <w:tcMar>
+              <w:top w:w="70" w:type="dxa"/>
+              <w:bottom w:w="70" w:type="dxa"/>
+              <w:left w:w="100" w:type="dxa"/>
+              <w:right w:w="100" w:type="dxa"/>
+            </w:tcMar>
+            <w:shd w:val="clear" w:color="auto" w:fill="FFFFFF"/>
+          </w:tcPr>
+          <w:p>
+            <w:pPr>
+              <w:spacing w:line="264" w:lineRule="auto" w:after="40"/>
+            </w:pPr>
+            <w:r>
+              <w:rPr>
+                <w:sz w:val="15"/>
+              </w:rPr>
+              <w:t>Interest Coverage (EBIT ÷ Interest)</w:t>
+            </w:r>
+          </w:p>
+        </w:tc>
+        <w:tc>
+          <w:tcPr>
+            <w:tcW w:type="dxa" w:w="1728"/>
+            <w:tcMar>
+              <w:top w:w="70" w:type="dxa"/>
+              <w:bottom w:w="70" w:type="dxa"/>
+              <w:left w:w="100" w:type="dxa"/>
+              <w:right w:w="100" w:type="dxa"/>
+            </w:tcMar>
+            <w:shd w:val="clear" w:color="auto" w:fill="FFFFFF"/>
+          </w:tcPr>
+          <w:p>
+            <w:pPr>
+              <w:spacing w:line="264" w:lineRule="auto" w:after="40"/>
+            </w:pPr>
+            <w:r>
+              <w:rPr>
+                <w:sz w:val="15"/>
+              </w:rPr>
+              <w:t>Low: ≥3.5x</w:t>
+              <w:br/>
+              <w:t>Mod: 1.5–3.5x</w:t>
+              <w:br/>
+              <w:t>High: &lt;1.5x</w:t>
+            </w:r>
+          </w:p>
+        </w:tc>
+        <w:tc>
+          <w:tcPr>
+            <w:tcW w:type="dxa" w:w="3168"/>
+            <w:tcMar>
+              <w:top w:w="70" w:type="dxa"/>
+              <w:bottom w:w="70" w:type="dxa"/>
+              <w:left w:w="100" w:type="dxa"/>
+              <w:right w:w="100" w:type="dxa"/>
+            </w:tcMar>
+            <w:shd w:val="clear" w:color="auto" w:fill="FFFFFF"/>
+          </w:tcPr>
+          <w:p>
+            <w:pPr>
+              <w:spacing w:line="264" w:lineRule="auto" w:after="40"/>
+            </w:pPr>
+            <w:r>
+              <w:rPr>
+                <w:sz w:val="15"/>
+              </w:rPr>
+              <w:t>Low: Operating earnings comfortably cover loan finance charges multiple times.</w:t>
+              <w:br/>
+              <w:t>Moderate: Tight servicing buffer; vulnerable to revenue drop.</w:t>
+              <w:br/>
+              <w:t>High: Operating income insufficient to service interest; imminent default risk.</w:t>
+            </w:r>
+          </w:p>
+        </w:tc>
+        <w:tc>
+          <w:tcPr>
+            <w:tcW w:type="dxa" w:w="2592"/>
+            <w:tcMar>
+              <w:top w:w="70" w:type="dxa"/>
+              <w:bottom w:w="70" w:type="dxa"/>
+              <w:left w:w="100" w:type="dxa"/>
+              <w:right w:w="100" w:type="dxa"/>
+            </w:tcMar>
+            <w:shd w:val="clear" w:color="auto" w:fill="FFFFFF"/>
+          </w:tcPr>
+          <w:p>
+            <w:pPr>
+              <w:spacing w:line="264" w:lineRule="auto" w:after="40"/>
+            </w:pPr>
+            <w:r>
+              <w:rPr>
+                <w:sz w:val="15"/>
+              </w:rPr>
+              <w:t>Refinance expensive short-term debt, negotiate lender rate reductions, and explore debt-to-equity conversion.</w:t>
+            </w:r>
+          </w:p>
+        </w:tc>
+      </w:tr>
+      <w:tr>
+        <w:tc>
+          <w:tcPr>
+            <w:tcW w:type="dxa" w:w="1296"/>
+            <w:tcMar>
+              <w:top w:w="70" w:type="dxa"/>
+              <w:bottom w:w="70" w:type="dxa"/>
+              <w:left w:w="100" w:type="dxa"/>
+              <w:right w:w="100" w:type="dxa"/>
+            </w:tcMar>
+            <w:shd w:val="clear" w:color="auto" w:fill="F0FDF4"/>
+          </w:tcPr>
+          <w:p>
+            <w:pPr>
+              <w:spacing w:line="264" w:lineRule="auto" w:after="40"/>
+            </w:pPr>
+            <w:r>
+              <w:rPr>
+                <w:sz w:val="15"/>
+              </w:rPr>
+              <w:t>Efficiency</w:t>
+            </w:r>
+          </w:p>
+        </w:tc>
+        <w:tc>
+          <w:tcPr>
+            <w:tcW w:type="dxa" w:w="1872"/>
+            <w:tcMar>
+              <w:top w:w="70" w:type="dxa"/>
+              <w:bottom w:w="70" w:type="dxa"/>
+              <w:left w:w="100" w:type="dxa"/>
+              <w:right w:w="100" w:type="dxa"/>
+            </w:tcMar>
+            <w:shd w:val="clear" w:color="auto" w:fill="F0FDF4"/>
+          </w:tcPr>
+          <w:p>
+            <w:pPr>
+              <w:spacing w:line="264" w:lineRule="auto" w:after="40"/>
+            </w:pPr>
+            <w:r>
+              <w:rPr>
+                <w:sz w:val="15"/>
+              </w:rPr>
+              <w:t>Inventory Turnover (COGS ÷ Avg Inv)</w:t>
+            </w:r>
+          </w:p>
+        </w:tc>
+        <w:tc>
+          <w:tcPr>
+            <w:tcW w:type="dxa" w:w="1728"/>
+            <w:tcMar>
+              <w:top w:w="70" w:type="dxa"/>
+              <w:bottom w:w="70" w:type="dxa"/>
+              <w:left w:w="100" w:type="dxa"/>
+              <w:right w:w="100" w:type="dxa"/>
+            </w:tcMar>
+            <w:shd w:val="clear" w:color="auto" w:fill="F0FDF4"/>
+          </w:tcPr>
+          <w:p>
+            <w:pPr>
+              <w:spacing w:line="264" w:lineRule="auto" w:after="40"/>
+            </w:pPr>
+            <w:r>
+              <w:rPr>
+                <w:sz w:val="15"/>
+              </w:rPr>
+              <w:t>Low: 4.0–10.0x</w:t>
+              <w:br/>
+              <w:t>Mod: 2.0–4.0x</w:t>
+              <w:br/>
+              <w:t>High: &lt;2.0x / &gt;14.0x</w:t>
+            </w:r>
+          </w:p>
+        </w:tc>
+        <w:tc>
+          <w:tcPr>
+            <w:tcW w:type="dxa" w:w="3168"/>
+            <w:tcMar>
+              <w:top w:w="70" w:type="dxa"/>
+              <w:bottom w:w="70" w:type="dxa"/>
+              <w:left w:w="100" w:type="dxa"/>
+              <w:right w:w="100" w:type="dxa"/>
+            </w:tcMar>
+            <w:shd w:val="clear" w:color="auto" w:fill="F0FDF4"/>
+          </w:tcPr>
+          <w:p>
+            <w:pPr>
+              <w:spacing w:line="264" w:lineRule="auto" w:after="40"/>
+            </w:pPr>
+            <w:r>
+              <w:rPr>
+                <w:sz w:val="15"/>
+              </w:rPr>
+              <w:t>Low: Balanced stock rotation; low obsolescence and minimal holding costs.</w:t>
+              <w:br/>
+              <w:t>Moderate: Sluggish stock rotation; working capital locked in warehouse.</w:t>
+              <w:br/>
+              <w:t>High (&lt;2x): Dead inventory write-off risk; High (&gt;14x): Stockout risk.</w:t>
+            </w:r>
+          </w:p>
+        </w:tc>
+        <w:tc>
+          <w:tcPr>
+            <w:tcW w:type="dxa" w:w="2592"/>
+            <w:tcMar>
+              <w:top w:w="70" w:type="dxa"/>
+              <w:bottom w:w="70" w:type="dxa"/>
+              <w:left w:w="100" w:type="dxa"/>
+              <w:right w:w="100" w:type="dxa"/>
+            </w:tcMar>
+            <w:shd w:val="clear" w:color="auto" w:fill="F0FDF4"/>
+          </w:tcPr>
+          <w:p>
+            <w:pPr>
+              <w:spacing w:line="264" w:lineRule="auto" w:after="40"/>
+            </w:pPr>
+            <w:r>
+              <w:rPr>
+                <w:sz w:val="15"/>
+              </w:rPr>
+              <w:t>Conduct SKU rationalization, calibrate production batch sizes, and liquidate slow-moving inventory via discount promotions.</w:t>
+            </w:r>
+          </w:p>
+        </w:tc>
+      </w:tr>
+      <w:tr>
+        <w:tc>
+          <w:tcPr>
+            <w:tcW w:type="dxa" w:w="1296"/>
+            <w:tcMar>
+              <w:top w:w="70" w:type="dxa"/>
+              <w:bottom w:w="70" w:type="dxa"/>
+              <w:left w:w="100" w:type="dxa"/>
+              <w:right w:w="100" w:type="dxa"/>
+            </w:tcMar>
+            <w:shd w:val="clear" w:color="auto" w:fill="FFFFFF"/>
+          </w:tcPr>
+          <w:p>
+            <w:pPr>
+              <w:spacing w:line="264" w:lineRule="auto" w:after="40"/>
+            </w:pPr>
+            <w:r>
+              <w:rPr>
+                <w:sz w:val="15"/>
+              </w:rPr>
+              <w:t>Efficiency</w:t>
+            </w:r>
+          </w:p>
+        </w:tc>
+        <w:tc>
+          <w:tcPr>
+            <w:tcW w:type="dxa" w:w="1872"/>
+            <w:tcMar>
+              <w:top w:w="70" w:type="dxa"/>
+              <w:bottom w:w="70" w:type="dxa"/>
+              <w:left w:w="100" w:type="dxa"/>
+              <w:right w:w="100" w:type="dxa"/>
+            </w:tcMar>
+            <w:shd w:val="clear" w:color="auto" w:fill="FFFFFF"/>
+          </w:tcPr>
+          <w:p>
+            <w:pPr>
+              <w:spacing w:line="264" w:lineRule="auto" w:after="40"/>
+            </w:pPr>
+            <w:r>
+              <w:rPr>
+                <w:sz w:val="15"/>
+              </w:rPr>
+              <w:t>Debtor Collection Days ((Rec × 365) ÷ Sales)</w:t>
+            </w:r>
+          </w:p>
+        </w:tc>
+        <w:tc>
+          <w:tcPr>
+            <w:tcW w:type="dxa" w:w="1728"/>
+            <w:tcMar>
+              <w:top w:w="70" w:type="dxa"/>
+              <w:bottom w:w="70" w:type="dxa"/>
+              <w:left w:w="100" w:type="dxa"/>
+              <w:right w:w="100" w:type="dxa"/>
+            </w:tcMar>
+            <w:shd w:val="clear" w:color="auto" w:fill="FFFFFF"/>
+          </w:tcPr>
+          <w:p>
+            <w:pPr>
+              <w:spacing w:line="264" w:lineRule="auto" w:after="40"/>
+            </w:pPr>
+            <w:r>
+              <w:rPr>
+                <w:sz w:val="15"/>
+              </w:rPr>
+              <w:t>Low: ≤45 days</w:t>
+              <w:br/>
+              <w:t>Mod: 45–75 days</w:t>
+              <w:br/>
+              <w:t>High: &gt;75 days</w:t>
+            </w:r>
+          </w:p>
+        </w:tc>
+        <w:tc>
+          <w:tcPr>
+            <w:tcW w:type="dxa" w:w="3168"/>
+            <w:tcMar>
+              <w:top w:w="70" w:type="dxa"/>
+              <w:bottom w:w="70" w:type="dxa"/>
+              <w:left w:w="100" w:type="dxa"/>
+              <w:right w:w="100" w:type="dxa"/>
+            </w:tcMar>
+            <w:shd w:val="clear" w:color="auto" w:fill="FFFFFF"/>
+          </w:tcPr>
+          <w:p>
+            <w:pPr>
+              <w:spacing w:line="264" w:lineRule="auto" w:after="40"/>
+            </w:pPr>
+            <w:r>
+              <w:rPr>
+                <w:sz w:val="15"/>
+              </w:rPr>
+              <w:t>Low: Debtors pay on time; healthy cash conversion cycle.</w:t>
+              <w:br/>
+              <w:t>Moderate: Collection cycle widening; working capital trapped.</w:t>
+              <w:br/>
+              <w:t>High: Severe customer payment delays; acute risk of distributor bad debt.</w:t>
+            </w:r>
+          </w:p>
+        </w:tc>
+        <w:tc>
+          <w:tcPr>
+            <w:tcW w:type="dxa" w:w="2592"/>
+            <w:tcMar>
+              <w:top w:w="70" w:type="dxa"/>
+              <w:bottom w:w="70" w:type="dxa"/>
+              <w:left w:w="100" w:type="dxa"/>
+              <w:right w:w="100" w:type="dxa"/>
+            </w:tcMar>
+            <w:shd w:val="clear" w:color="auto" w:fill="FFFFFF"/>
+          </w:tcPr>
+          <w:p>
+            <w:pPr>
+              <w:spacing w:line="264" w:lineRule="auto" w:after="40"/>
+            </w:pPr>
+            <w:r>
+              <w:rPr>
+                <w:sz w:val="15"/>
+              </w:rPr>
+              <w:t>Enforce prompt payment settlement discounts (e.g. 2/10 net 30), impose late payment interest, and freeze delinquent accounts.</w:t>
+            </w:r>
+          </w:p>
+        </w:tc>
+      </w:tr>
+      <w:tr>
+        <w:tc>
+          <w:tcPr>
+            <w:tcW w:type="dxa" w:w="1296"/>
+            <w:tcMar>
+              <w:top w:w="70" w:type="dxa"/>
+              <w:bottom w:w="70" w:type="dxa"/>
+              <w:left w:w="100" w:type="dxa"/>
+              <w:right w:w="100" w:type="dxa"/>
+            </w:tcMar>
+            <w:shd w:val="clear" w:color="auto" w:fill="F0FDF4"/>
+          </w:tcPr>
+          <w:p>
+            <w:pPr>
+              <w:spacing w:line="264" w:lineRule="auto" w:after="40"/>
+            </w:pPr>
+            <w:r>
+              <w:rPr>
+                <w:sz w:val="15"/>
+              </w:rPr>
+              <w:t>Cash Flow</w:t>
+            </w:r>
+          </w:p>
+        </w:tc>
+        <w:tc>
+          <w:tcPr>
+            <w:tcW w:type="dxa" w:w="1872"/>
+            <w:tcMar>
+              <w:top w:w="70" w:type="dxa"/>
+              <w:bottom w:w="70" w:type="dxa"/>
+              <w:left w:w="100" w:type="dxa"/>
+              <w:right w:w="100" w:type="dxa"/>
+            </w:tcMar>
+            <w:shd w:val="clear" w:color="auto" w:fill="F0FDF4"/>
+          </w:tcPr>
+          <w:p>
+            <w:pPr>
+              <w:spacing w:line="264" w:lineRule="auto" w:after="40"/>
+            </w:pPr>
+            <w:r>
+              <w:rPr>
+                <w:sz w:val="15"/>
+              </w:rPr>
+              <w:t>Altman Z-Score Solvency Index</w:t>
+            </w:r>
+          </w:p>
+        </w:tc>
+        <w:tc>
+          <w:tcPr>
+            <w:tcW w:type="dxa" w:w="1728"/>
+            <w:tcMar>
+              <w:top w:w="70" w:type="dxa"/>
+              <w:bottom w:w="70" w:type="dxa"/>
+              <w:left w:w="100" w:type="dxa"/>
+              <w:right w:w="100" w:type="dxa"/>
+            </w:tcMar>
+            <w:shd w:val="clear" w:color="auto" w:fill="F0FDF4"/>
+          </w:tcPr>
+          <w:p>
+            <w:pPr>
+              <w:spacing w:line="264" w:lineRule="auto" w:after="40"/>
+            </w:pPr>
+            <w:r>
+              <w:rPr>
+                <w:sz w:val="15"/>
+              </w:rPr>
+              <w:t>Safe: &gt;2.99</w:t>
+              <w:br/>
+              <w:t>Grey: 1.81–2.99</w:t>
+              <w:br/>
+              <w:t>Distress: &lt;1.81</w:t>
+            </w:r>
+          </w:p>
+        </w:tc>
+        <w:tc>
+          <w:tcPr>
+            <w:tcW w:type="dxa" w:w="3168"/>
+            <w:tcMar>
+              <w:top w:w="70" w:type="dxa"/>
+              <w:bottom w:w="70" w:type="dxa"/>
+              <w:left w:w="100" w:type="dxa"/>
+              <w:right w:w="100" w:type="dxa"/>
+            </w:tcMar>
+            <w:shd w:val="clear" w:color="auto" w:fill="F0FDF4"/>
+          </w:tcPr>
+          <w:p>
+            <w:pPr>
+              <w:spacing w:line="264" w:lineRule="auto" w:after="40"/>
+            </w:pPr>
+            <w:r>
+              <w:rPr>
+                <w:sz w:val="15"/>
+              </w:rPr>
+              <w:t>Safe: Minimal probability of insolvency over 24-month horizon.</w:t>
+              <w:br/>
+              <w:t>Grey: Moderate structural vulnerability; heightened vigilance needed.</w:t>
+              <w:br/>
+              <w:t>Distress: High quantitative probability of bankruptcy within 2 years.</w:t>
+            </w:r>
+          </w:p>
+        </w:tc>
+        <w:tc>
+          <w:tcPr>
+            <w:tcW w:type="dxa" w:w="2592"/>
+            <w:tcMar>
+              <w:top w:w="70" w:type="dxa"/>
+              <w:bottom w:w="70" w:type="dxa"/>
+              <w:left w:w="100" w:type="dxa"/>
+              <w:right w:w="100" w:type="dxa"/>
+            </w:tcMar>
+            <w:shd w:val="clear" w:color="auto" w:fill="F0FDF4"/>
+          </w:tcPr>
+          <w:p>
+            <w:pPr>
+              <w:spacing w:line="264" w:lineRule="auto" w:after="40"/>
+            </w:pPr>
+            <w:r>
+              <w:rPr>
+                <w:sz w:val="15"/>
+              </w:rPr>
+              <w:t>Convene executive CRO risk committee, freeze discretionary capital outlays, and formulate immediate financial turnaround plan.</w:t>
+            </w:r>
+          </w:p>
+        </w:tc>
+      </w:tr>
+    </w:tbl>
+    <w:p>
+      <w:r>
+        <w:rPr>
+          <w:i/>
+          <w:color w:val="475569"/>
+          <w:sz w:val="17"/>
+        </w:rPr>
+        <w:t>Specialized Financial Diagnostic Rules Applied by RiskGuard Pro:</w:t>
+        <w:br/>
+        <w:t>1. Non-Monotonicity: Higher turnover is not always lower risk (e.g., turnover &gt;14x signals extreme stockout risk).</w:t>
+        <w:br/>
+        <w:t>2. Missing / Zero Division Safeguard: Unpopulated parameters or zero denominators trigger "Insufficient Data / N/A" rather than defaulting to an erroneous Low Risk rating.</w:t>
+        <w:br/>
+        <w:t>3. Negative Net Profit: Generates an automatic high-severity restructuring action task in the ISO 31000 Action Tracker.</w:t>
+        <w:br/>
+        <w:t>4. Holistic Assessment: No single financial ratio determines overall corporate health; scores are weighted across all 6 domains.</w:t>
+      </w:r>
+    </w:p>
+    <w:p>
+      <w:pPr>
         <w:keepNext/>
         <w:spacing w:before="320" w:after="120"/>
       </w:pPr>

</xml_diff>